<commit_message>
Melhorias na geração do laudo e equipes policiais
- Adiciona GCM à lista de tipos de equipe policial
- Renomeia campo "Matrícula" para "RG" para PM e Bombeiros
- Corrige texto contraditório da equipe de resgate (naoEstavaNoLocal)
- Adiciona "Presença de" antes de cada lesão e vestígio (local e veículo)
- Remove "Apenas registrado" repetitivo; agrupa nota de não coletados ao final
- Melhora formato das lesões: remove dois-pontos, flui como prosa
- Corrige seleção de PDF no iOS: lê bytes do path se FilePicker não retornar dados

Co-Authored-By: Claude Sonnet 4.6 <noreply@anthropic.com>
</commit_message>
<xml_diff>
--- a/assets/templates/Laudo_PADRON._Disparo_de_Arma_de_Fogo.docx
+++ b/assets/templates/Laudo_PADRON._Disparo_de_Arma_de_Fogo.docx
@@ -3681,6 +3681,7 @@
           <w:szCs w:val="24"/>
         </w:rPr>
       </w:pPr>
+      <w:bookmarkStart w:id="0" w:name="OLE_LINK5"/>
       <w:r>
         <w:rPr>
           <w:rFonts w:cs="Arial"/>
@@ -3782,6 +3783,7 @@
         <w:t>;</w:t>
       </w:r>
     </w:p>
+    <w:bookmarkEnd w:id="0"/>
     <w:p>
       <w:pPr>
         <w:pStyle w:val="PargrafodaLista"/>
@@ -7573,8 +7575,8 @@
         <w:szCs w:val="24"/>
       </w:rPr>
     </w:pPr>
-    <w:bookmarkStart w:id="0" w:name="_Hlk22592295"/>
-    <w:bookmarkStart w:id="1" w:name="_Hlk22592296"/>
+    <w:bookmarkStart w:id="1" w:name="_Hlk22592295"/>
+    <w:bookmarkStart w:id="2" w:name="_Hlk22592296"/>
     <w:r>
       <w:rPr>
         <w:noProof/>
@@ -7776,8 +7778,8 @@
       </w:rPr>
     </w:pPr>
   </w:p>
-  <w:bookmarkEnd w:id="0"/>
   <w:bookmarkEnd w:id="1"/>
+  <w:bookmarkEnd w:id="2"/>
   <w:p>
     <w:pPr>
       <w:pStyle w:val="Cabealho"/>

</xml_diff>